<commit_message>
automation databases mini project
</commit_message>
<xml_diff>
--- a/Python Notes.docx
+++ b/Python Notes.docx
@@ -302,7 +302,7 @@
           </mc:Choice>
           <mc:Fallback>
             <w:pict>
-              <v:shapetype w14:anchorId="423A3307" id="_x0000_t32" coordsize="21600,21600" o:spt="32" o:oned="t" path="m,l21600,21600e" filled="f">
+              <v:shapetype w14:anchorId="109A1CE5" id="_x0000_t32" coordsize="21600,21600" o:spt="32" o:oned="t" path="m,l21600,21600e" filled="f">
                 <v:path arrowok="t" fillok="f" o:connecttype="none"/>
                 <o:lock v:ext="edit" shapetype="t"/>
               </v:shapetype>
@@ -30611,22 +30611,729 @@
     </w:p>
     <w:p>
       <w:pPr>
+        <w:rPr>
+          <w:ins w:id="2214" w:author="Prakash Singh Kshatreeya" w:date="2026-05-10T10:07:00Z"/>
+          <w:sz w:val="28"/>
+          <w:szCs w:val="28"/>
+          <w:lang w:val="en-US"/>
+        </w:rPr>
+      </w:pPr>
+    </w:p>
+    <w:p>
+      <w:pPr>
+        <w:rPr>
+          <w:ins w:id="2215" w:author="Prakash Singh Kshatreeya" w:date="2026-05-10T10:07:00Z"/>
+          <w:sz w:val="28"/>
+          <w:szCs w:val="28"/>
+          <w:lang w:val="en-US"/>
+        </w:rPr>
+      </w:pPr>
+    </w:p>
+    <w:p>
+      <w:pPr>
+        <w:rPr>
+          <w:ins w:id="2216" w:author="Prakash Singh Kshatreeya" w:date="2026-05-10T10:07:00Z"/>
+          <w:sz w:val="28"/>
+          <w:szCs w:val="28"/>
+          <w:lang w:val="en-US"/>
+        </w:rPr>
+      </w:pPr>
+    </w:p>
+    <w:p>
+      <w:pPr>
+        <w:rPr>
+          <w:ins w:id="2217" w:author="Prakash Singh Kshatreeya" w:date="2026-05-10T10:07:00Z"/>
+          <w:sz w:val="28"/>
+          <w:szCs w:val="28"/>
+          <w:lang w:val="en-US"/>
+        </w:rPr>
+      </w:pPr>
+    </w:p>
+    <w:p>
+      <w:pPr>
+        <w:rPr>
+          <w:ins w:id="2218" w:author="Prakash Singh Kshatreeya" w:date="2026-05-10T10:07:00Z"/>
+          <w:sz w:val="28"/>
+          <w:szCs w:val="28"/>
+          <w:lang w:val="en-US"/>
+        </w:rPr>
+      </w:pPr>
+    </w:p>
+    <w:p>
+      <w:pPr>
+        <w:rPr>
+          <w:ins w:id="2219" w:author="Prakash Singh Kshatreeya" w:date="2026-05-10T10:07:00Z"/>
+          <w:sz w:val="28"/>
+          <w:szCs w:val="28"/>
+          <w:lang w:val="en-US"/>
+        </w:rPr>
+      </w:pPr>
+    </w:p>
+    <w:p>
+      <w:pPr>
+        <w:rPr>
+          <w:ins w:id="2220" w:author="Prakash Singh Kshatreeya" w:date="2026-05-10T10:07:00Z"/>
+          <w:sz w:val="28"/>
+          <w:szCs w:val="28"/>
+          <w:lang w:val="en-US"/>
+        </w:rPr>
+      </w:pPr>
+    </w:p>
+    <w:p>
+      <w:pPr>
+        <w:rPr>
+          <w:ins w:id="2221" w:author="Prakash Singh Kshatreeya" w:date="2026-05-10T10:07:00Z"/>
+          <w:sz w:val="28"/>
+          <w:szCs w:val="28"/>
+          <w:lang w:val="en-US"/>
+        </w:rPr>
+      </w:pPr>
+    </w:p>
+    <w:p>
+      <w:pPr>
+        <w:rPr>
+          <w:ins w:id="2222" w:author="Prakash Singh Kshatreeya" w:date="2026-05-10T10:07:00Z"/>
+          <w:sz w:val="28"/>
+          <w:szCs w:val="28"/>
+          <w:lang w:val="en-US"/>
+        </w:rPr>
+      </w:pPr>
+    </w:p>
+    <w:p>
+      <w:pPr>
+        <w:rPr>
+          <w:ins w:id="2223" w:author="Prakash Singh Kshatreeya" w:date="2026-05-10T10:07:00Z"/>
+          <w:sz w:val="28"/>
+          <w:szCs w:val="28"/>
+          <w:lang w:val="en-US"/>
+        </w:rPr>
+      </w:pPr>
+    </w:p>
+    <w:p>
+      <w:pPr>
+        <w:rPr>
+          <w:ins w:id="2224" w:author="Prakash Singh Kshatreeya" w:date="2026-05-10T10:07:00Z"/>
+          <w:sz w:val="28"/>
+          <w:szCs w:val="28"/>
+          <w:lang w:val="en-US"/>
+        </w:rPr>
+      </w:pPr>
+    </w:p>
+    <w:p>
+      <w:pPr>
+        <w:rPr>
+          <w:ins w:id="2225" w:author="Prakash Singh Kshatreeya" w:date="2026-05-10T10:07:00Z"/>
+          <w:sz w:val="28"/>
+          <w:szCs w:val="28"/>
+          <w:lang w:val="en-US"/>
+        </w:rPr>
+      </w:pPr>
+    </w:p>
+    <w:p>
+      <w:pPr>
+        <w:rPr>
+          <w:ins w:id="2226" w:author="Prakash Singh Kshatreeya" w:date="2026-05-10T10:07:00Z"/>
+          <w:sz w:val="28"/>
+          <w:szCs w:val="28"/>
+          <w:lang w:val="en-US"/>
+        </w:rPr>
+      </w:pPr>
+    </w:p>
+    <w:p>
+      <w:pPr>
+        <w:rPr>
+          <w:ins w:id="2227" w:author="Prakash Singh Kshatreeya" w:date="2026-05-10T10:07:00Z"/>
+          <w:sz w:val="28"/>
+          <w:szCs w:val="28"/>
+          <w:lang w:val="en-US"/>
+        </w:rPr>
+      </w:pPr>
+    </w:p>
+    <w:p>
+      <w:pPr>
+        <w:rPr>
+          <w:ins w:id="2228" w:author="Prakash Singh Kshatreeya" w:date="2026-05-10T10:07:00Z"/>
+          <w:b/>
+          <w:bCs/>
+          <w:sz w:val="28"/>
+          <w:szCs w:val="28"/>
+          <w:lang w:val="en-US"/>
+        </w:rPr>
+      </w:pPr>
+      <w:ins w:id="2229" w:author="Prakash Singh Kshatreeya" w:date="2026-05-10T10:07:00Z">
+        <w:r>
+          <w:rPr>
+            <w:b/>
+            <w:bCs/>
+            <w:sz w:val="28"/>
+            <w:szCs w:val="28"/>
+            <w:lang w:val="en-US"/>
+          </w:rPr>
+          <w:lastRenderedPageBreak/>
+          <w:t xml:space="preserve">DATABASE =&gt; </w:t>
+        </w:r>
+      </w:ins>
+    </w:p>
+    <w:p>
+      <w:pPr>
+        <w:rPr>
+          <w:ins w:id="2230" w:author="Prakash Singh Kshatreeya" w:date="2026-05-10T10:58:00Z"/>
+          <w:b/>
+          <w:bCs/>
+          <w:sz w:val="28"/>
+          <w:szCs w:val="28"/>
+          <w:lang w:val="en-US"/>
+        </w:rPr>
+      </w:pPr>
+      <w:ins w:id="2231" w:author="Prakash Singh Kshatreeya" w:date="2026-05-10T10:58:00Z">
+        <w:r>
+          <w:rPr>
+            <w:b/>
+            <w:bCs/>
+            <w:sz w:val="28"/>
+            <w:szCs w:val="28"/>
+            <w:lang w:val="en-US"/>
+          </w:rPr>
+          <w:t xml:space="preserve">How to install </w:t>
+        </w:r>
+        <w:proofErr w:type="spellStart"/>
+        <w:r>
+          <w:rPr>
+            <w:b/>
+            <w:bCs/>
+            <w:sz w:val="28"/>
+            <w:szCs w:val="28"/>
+            <w:lang w:val="en-US"/>
+          </w:rPr>
+          <w:t>sqlite</w:t>
+        </w:r>
+        <w:proofErr w:type="spellEnd"/>
+      </w:ins>
+    </w:p>
+    <w:p>
+      <w:pPr>
+        <w:rPr>
+          <w:ins w:id="2232" w:author="Prakash Singh Kshatreeya" w:date="2026-05-10T10:58:00Z"/>
+          <w:b/>
+          <w:bCs/>
+          <w:sz w:val="28"/>
+          <w:szCs w:val="28"/>
+          <w:lang w:val="en-US"/>
+        </w:rPr>
+      </w:pPr>
+    </w:p>
+    <w:p>
+      <w:pPr>
+        <w:rPr>
+          <w:ins w:id="2233" w:author="Prakash Singh Kshatreeya" w:date="2026-05-10T11:09:00Z"/>
+          <w:b/>
+          <w:bCs/>
+          <w:sz w:val="28"/>
+          <w:szCs w:val="28"/>
+          <w:lang w:val="en-US"/>
+        </w:rPr>
+      </w:pPr>
+      <w:ins w:id="2234" w:author="Prakash Singh Kshatreeya" w:date="2026-05-10T10:58:00Z">
+        <w:r>
+          <w:rPr>
+            <w:b/>
+            <w:bCs/>
+            <w:sz w:val="28"/>
+            <w:szCs w:val="28"/>
+            <w:lang w:val="en-US"/>
+          </w:rPr>
+          <w:t>C:\program file\</w:t>
+        </w:r>
+        <w:proofErr w:type="spellStart"/>
+        <w:r>
+          <w:rPr>
+            <w:b/>
+            <w:bCs/>
+            <w:sz w:val="28"/>
+            <w:szCs w:val="28"/>
+            <w:lang w:val="en-US"/>
+          </w:rPr>
+          <w:t>create_filename”sqlite</w:t>
+        </w:r>
+        <w:proofErr w:type="spellEnd"/>
+        <w:r>
+          <w:rPr>
+            <w:b/>
+            <w:bCs/>
+            <w:sz w:val="28"/>
+            <w:szCs w:val="28"/>
+            <w:lang w:val="en-US"/>
+          </w:rPr>
+          <w:t>” and past</w:t>
+        </w:r>
+      </w:ins>
+    </w:p>
+    <w:p>
+      <w:pPr>
+        <w:rPr>
+          <w:ins w:id="2235" w:author="Prakash Singh Kshatreeya" w:date="2026-05-10T11:09:00Z"/>
+          <w:b/>
+          <w:bCs/>
+          <w:sz w:val="28"/>
+          <w:szCs w:val="28"/>
+          <w:lang w:val="en-US"/>
+        </w:rPr>
+      </w:pPr>
+    </w:p>
+    <w:p>
+      <w:pPr>
+        <w:rPr>
+          <w:ins w:id="2236" w:author="Prakash Singh Kshatreeya" w:date="2026-05-10T11:09:00Z"/>
+          <w:b/>
+          <w:bCs/>
+          <w:sz w:val="28"/>
+          <w:szCs w:val="28"/>
+          <w:lang w:val="en-US"/>
+        </w:rPr>
+      </w:pPr>
+      <w:proofErr w:type="gramStart"/>
+      <w:ins w:id="2237" w:author="Prakash Singh Kshatreeya" w:date="2026-05-10T11:09:00Z">
+        <w:r>
+          <w:rPr>
+            <w:b/>
+            <w:bCs/>
+            <w:sz w:val="28"/>
+            <w:szCs w:val="28"/>
+            <w:lang w:val="en-US"/>
+          </w:rPr>
+          <w:t>.headers</w:t>
+        </w:r>
+        <w:proofErr w:type="gramEnd"/>
+        <w:r>
+          <w:rPr>
+            <w:b/>
+            <w:bCs/>
+            <w:sz w:val="28"/>
+            <w:szCs w:val="28"/>
+            <w:lang w:val="en-US"/>
+          </w:rPr>
+          <w:t xml:space="preserve"> on</w:t>
+        </w:r>
+      </w:ins>
+    </w:p>
+    <w:p>
+      <w:pPr>
+        <w:rPr>
+          <w:ins w:id="2238" w:author="Prakash Singh Kshatreeya" w:date="2026-05-10T11:09:00Z"/>
+          <w:b/>
+          <w:bCs/>
+          <w:sz w:val="28"/>
+          <w:szCs w:val="28"/>
+          <w:lang w:val="en-US"/>
+        </w:rPr>
+      </w:pPr>
+      <w:proofErr w:type="gramStart"/>
+      <w:ins w:id="2239" w:author="Prakash Singh Kshatreeya" w:date="2026-05-10T11:09:00Z">
+        <w:r>
+          <w:rPr>
+            <w:b/>
+            <w:bCs/>
+            <w:sz w:val="28"/>
+            <w:szCs w:val="28"/>
+            <w:lang w:val="en-US"/>
+          </w:rPr>
+          <w:t>.mode</w:t>
+        </w:r>
+        <w:proofErr w:type="gramEnd"/>
+        <w:r>
+          <w:rPr>
+            <w:b/>
+            <w:bCs/>
+            <w:sz w:val="28"/>
+            <w:szCs w:val="28"/>
+            <w:lang w:val="en-US"/>
+          </w:rPr>
+          <w:t xml:space="preserve"> box</w:t>
+        </w:r>
+      </w:ins>
+    </w:p>
+    <w:p>
+      <w:pPr>
+        <w:rPr>
+          <w:ins w:id="2240" w:author="Prakash Singh Kshatreeya" w:date="2026-05-10T11:13:00Z"/>
+          <w:b/>
+          <w:bCs/>
+          <w:sz w:val="28"/>
+          <w:szCs w:val="28"/>
+          <w:lang w:val="en-US"/>
+        </w:rPr>
+      </w:pPr>
+      <w:proofErr w:type="gramStart"/>
+      <w:ins w:id="2241" w:author="Prakash Singh Kshatreeya" w:date="2026-05-10T11:09:00Z">
+        <w:r>
+          <w:rPr>
+            <w:b/>
+            <w:bCs/>
+            <w:sz w:val="28"/>
+            <w:szCs w:val="28"/>
+            <w:lang w:val="en-US"/>
+          </w:rPr>
+          <w:t>.mode</w:t>
+        </w:r>
+        <w:proofErr w:type="gramEnd"/>
+        <w:r>
+          <w:rPr>
+            <w:b/>
+            <w:bCs/>
+            <w:sz w:val="28"/>
+            <w:szCs w:val="28"/>
+            <w:lang w:val="en-US"/>
+          </w:rPr>
+          <w:t xml:space="preserve"> column</w:t>
+        </w:r>
+      </w:ins>
+    </w:p>
+    <w:p>
+      <w:pPr>
+        <w:rPr>
+          <w:ins w:id="2242" w:author="Prakash Singh Kshatreeya" w:date="2026-05-10T11:13:00Z"/>
+          <w:b/>
+          <w:bCs/>
+          <w:sz w:val="28"/>
+          <w:szCs w:val="28"/>
+          <w:lang w:val="en-US"/>
+        </w:rPr>
+      </w:pPr>
+    </w:p>
+    <w:p>
+      <w:pPr>
+        <w:rPr>
+          <w:ins w:id="2243" w:author="Prakash Singh Kshatreeya" w:date="2026-05-10T11:56:00Z"/>
+          <w:b/>
+          <w:bCs/>
+          <w:sz w:val="28"/>
+          <w:szCs w:val="28"/>
+          <w:lang w:val="en-US"/>
+        </w:rPr>
+      </w:pPr>
+      <w:ins w:id="2244" w:author="Prakash Singh Kshatreeya" w:date="2026-05-10T11:13:00Z">
+        <w:r>
+          <w:rPr>
+            <w:b/>
+            <w:bCs/>
+            <w:sz w:val="28"/>
+            <w:szCs w:val="28"/>
+            <w:lang w:val="en-US"/>
+          </w:rPr>
+          <w:t>Check schema =</w:t>
+        </w:r>
+        <w:proofErr w:type="gramStart"/>
+        <w:r>
+          <w:rPr>
+            <w:b/>
+            <w:bCs/>
+            <w:sz w:val="28"/>
+            <w:szCs w:val="28"/>
+            <w:lang w:val="en-US"/>
+          </w:rPr>
+          <w:t>&gt; .schema</w:t>
+        </w:r>
+        <w:proofErr w:type="gramEnd"/>
+        <w:r>
+          <w:rPr>
+            <w:b/>
+            <w:bCs/>
+            <w:sz w:val="28"/>
+            <w:szCs w:val="28"/>
+            <w:lang w:val="en-US"/>
+          </w:rPr>
+          <w:t xml:space="preserve"> </w:t>
+        </w:r>
+      </w:ins>
+      <w:proofErr w:type="spellStart"/>
+      <w:ins w:id="2245" w:author="Prakash Singh Kshatreeya" w:date="2026-05-10T11:14:00Z">
+        <w:r>
+          <w:rPr>
+            <w:b/>
+            <w:bCs/>
+            <w:sz w:val="28"/>
+            <w:szCs w:val="28"/>
+            <w:lang w:val="en-US"/>
+          </w:rPr>
+          <w:t>schema_name</w:t>
+        </w:r>
+      </w:ins>
+      <w:proofErr w:type="spellEnd"/>
+    </w:p>
+    <w:p>
+      <w:pPr>
+        <w:rPr>
+          <w:ins w:id="2246" w:author="Prakash Singh Kshatreeya" w:date="2026-05-10T11:56:00Z"/>
+          <w:b/>
+          <w:bCs/>
+          <w:sz w:val="28"/>
+          <w:szCs w:val="28"/>
+          <w:lang w:val="en-US"/>
+        </w:rPr>
+      </w:pPr>
+    </w:p>
+    <w:p>
+      <w:pPr>
+        <w:rPr>
+          <w:ins w:id="2247" w:author="Prakash Singh Kshatreeya" w:date="2026-05-10T11:56:00Z"/>
+          <w:b/>
+          <w:bCs/>
+          <w:sz w:val="28"/>
+          <w:szCs w:val="28"/>
+          <w:lang w:val="en-US"/>
+        </w:rPr>
+      </w:pPr>
+    </w:p>
+    <w:p>
+      <w:pPr>
+        <w:rPr>
+          <w:ins w:id="2248" w:author="Prakash Singh Kshatreeya" w:date="2026-05-10T11:56:00Z"/>
+          <w:b/>
+          <w:bCs/>
+          <w:sz w:val="28"/>
+          <w:szCs w:val="28"/>
+          <w:lang w:val="en-US"/>
+        </w:rPr>
+      </w:pPr>
+    </w:p>
+    <w:p>
+      <w:pPr>
+        <w:rPr>
+          <w:ins w:id="2249" w:author="Prakash Singh Kshatreeya" w:date="2026-05-10T12:10:00Z"/>
+          <w:b/>
+          <w:bCs/>
+          <w:sz w:val="28"/>
+          <w:szCs w:val="28"/>
+          <w:lang w:val="en-US"/>
+        </w:rPr>
+      </w:pPr>
+      <w:proofErr w:type="spellStart"/>
+      <w:ins w:id="2250" w:author="Prakash Singh Kshatreeya" w:date="2026-05-10T11:56:00Z">
+        <w:r>
+          <w:rPr>
+            <w:b/>
+            <w:bCs/>
+            <w:sz w:val="28"/>
+            <w:szCs w:val="28"/>
+            <w:lang w:val="en-US"/>
+          </w:rPr>
+          <w:t>Mongoos</w:t>
+        </w:r>
+      </w:ins>
+      <w:proofErr w:type="spellEnd"/>
+    </w:p>
+    <w:p>
+      <w:pPr>
+        <w:rPr>
+          <w:ins w:id="2251" w:author="Prakash Singh Kshatreeya" w:date="2026-05-10T11:57:00Z"/>
+          <w:b/>
+          <w:bCs/>
+          <w:sz w:val="28"/>
+          <w:szCs w:val="28"/>
+          <w:lang w:val="en-US"/>
+        </w:rPr>
+      </w:pPr>
+      <w:ins w:id="2252" w:author="Prakash Singh Kshatreeya" w:date="2026-05-10T12:11:00Z">
+        <w:r>
+          <w:rPr>
+            <w:b/>
+            <w:bCs/>
+            <w:sz w:val="28"/>
+            <w:szCs w:val="28"/>
+            <w:lang w:val="en-US"/>
+          </w:rPr>
+          <w:t xml:space="preserve">Pip install </w:t>
+        </w:r>
+      </w:ins>
+      <w:proofErr w:type="spellStart"/>
+      <w:ins w:id="2253" w:author="Prakash Singh Kshatreeya" w:date="2026-05-10T12:10:00Z">
+        <w:r>
+          <w:rPr>
+            <w:b/>
+            <w:bCs/>
+            <w:sz w:val="28"/>
+            <w:szCs w:val="28"/>
+            <w:lang w:val="en-US"/>
+          </w:rPr>
+          <w:t>pymongo</w:t>
+        </w:r>
+      </w:ins>
+      <w:proofErr w:type="spellEnd"/>
+    </w:p>
+    <w:p>
+      <w:pPr>
         <w:pStyle w:val="ListParagraph"/>
         <w:numPr>
           <w:ilvl w:val="0"/>
-          <w:numId w:val="5"/>
+          <w:numId w:val="3"/>
         </w:numPr>
         <w:rPr>
-          <w:sz w:val="28"/>
-          <w:szCs w:val="28"/>
-          <w:lang w:val="en-US"/>
-          <w:rPrChange w:id="2214" w:author="Prakash Singh Kshatreeya" w:date="2026-05-03T12:28:00Z">
+          <w:ins w:id="2254" w:author="Prakash Singh Kshatreeya" w:date="2026-05-10T11:57:00Z"/>
+          <w:b/>
+          <w:bCs/>
+          <w:sz w:val="28"/>
+          <w:szCs w:val="28"/>
+          <w:lang w:val="en-US"/>
+        </w:rPr>
+      </w:pPr>
+      <w:ins w:id="2255" w:author="Prakash Singh Kshatreeya" w:date="2026-05-10T11:57:00Z">
+        <w:r>
+          <w:rPr>
+            <w:b/>
+            <w:bCs/>
+            <w:sz w:val="28"/>
+            <w:szCs w:val="28"/>
+            <w:lang w:val="en-US"/>
+          </w:rPr>
+          <w:t xml:space="preserve">Show </w:t>
+        </w:r>
+        <w:proofErr w:type="spellStart"/>
+        <w:r>
+          <w:rPr>
+            <w:b/>
+            <w:bCs/>
+            <w:sz w:val="28"/>
+            <w:szCs w:val="28"/>
+            <w:lang w:val="en-US"/>
+          </w:rPr>
+          <w:t>dbs</w:t>
+        </w:r>
+        <w:proofErr w:type="spellEnd"/>
+      </w:ins>
+    </w:p>
+    <w:p>
+      <w:pPr>
+        <w:pStyle w:val="ListParagraph"/>
+        <w:numPr>
+          <w:ilvl w:val="0"/>
+          <w:numId w:val="3"/>
+        </w:numPr>
+        <w:rPr>
+          <w:ins w:id="2256" w:author="Prakash Singh Kshatreeya" w:date="2026-05-10T11:57:00Z"/>
+          <w:b/>
+          <w:bCs/>
+          <w:sz w:val="28"/>
+          <w:szCs w:val="28"/>
+          <w:lang w:val="en-US"/>
+        </w:rPr>
+      </w:pPr>
+      <w:ins w:id="2257" w:author="Prakash Singh Kshatreeya" w:date="2026-05-10T11:57:00Z">
+        <w:r>
+          <w:rPr>
+            <w:b/>
+            <w:bCs/>
+            <w:sz w:val="28"/>
+            <w:szCs w:val="28"/>
+            <w:lang w:val="en-US"/>
+          </w:rPr>
+          <w:t>Db</w:t>
+        </w:r>
+      </w:ins>
+    </w:p>
+    <w:p>
+      <w:pPr>
+        <w:pStyle w:val="ListParagraph"/>
+        <w:numPr>
+          <w:ilvl w:val="0"/>
+          <w:numId w:val="3"/>
+        </w:numPr>
+        <w:rPr>
+          <w:ins w:id="2258" w:author="Prakash Singh Kshatreeya" w:date="2026-05-10T11:58:00Z"/>
+          <w:b/>
+          <w:bCs/>
+          <w:sz w:val="28"/>
+          <w:szCs w:val="28"/>
+          <w:lang w:val="en-US"/>
+        </w:rPr>
+      </w:pPr>
+      <w:ins w:id="2259" w:author="Prakash Singh Kshatreeya" w:date="2026-05-10T11:58:00Z">
+        <w:r>
+          <w:rPr>
+            <w:b/>
+            <w:bCs/>
+            <w:sz w:val="28"/>
+            <w:szCs w:val="28"/>
+            <w:lang w:val="en-US"/>
+          </w:rPr>
+          <w:t>Show collections</w:t>
+        </w:r>
+      </w:ins>
+    </w:p>
+    <w:p>
+      <w:pPr>
+        <w:pStyle w:val="ListParagraph"/>
+        <w:numPr>
+          <w:ilvl w:val="0"/>
+          <w:numId w:val="3"/>
+        </w:numPr>
+        <w:rPr>
+          <w:ins w:id="2260" w:author="Prakash Singh Kshatreeya" w:date="2026-05-10T11:58:00Z"/>
+          <w:b/>
+          <w:bCs/>
+          <w:sz w:val="28"/>
+          <w:szCs w:val="28"/>
+          <w:lang w:val="en-US"/>
+        </w:rPr>
+      </w:pPr>
+      <w:proofErr w:type="spellStart"/>
+      <w:proofErr w:type="gramStart"/>
+      <w:ins w:id="2261" w:author="Prakash Singh Kshatreeya" w:date="2026-05-10T11:59:00Z">
+        <w:r>
+          <w:rPr>
+            <w:b/>
+            <w:bCs/>
+            <w:sz w:val="28"/>
+            <w:szCs w:val="28"/>
+            <w:lang w:val="en-US"/>
+          </w:rPr>
+          <w:t>d</w:t>
+        </w:r>
+      </w:ins>
+      <w:ins w:id="2262" w:author="Prakash Singh Kshatreeya" w:date="2026-05-10T11:58:00Z">
+        <w:r>
+          <w:rPr>
+            <w:b/>
+            <w:bCs/>
+            <w:sz w:val="28"/>
+            <w:szCs w:val="28"/>
+            <w:lang w:val="en-US"/>
+          </w:rPr>
+          <w:t>b.createCollection</w:t>
+        </w:r>
+        <w:proofErr w:type="spellEnd"/>
+        <w:proofErr w:type="gramEnd"/>
+        <w:r>
+          <w:rPr>
+            <w:b/>
+            <w:bCs/>
+            <w:sz w:val="28"/>
+            <w:szCs w:val="28"/>
+            <w:lang w:val="en-US"/>
+          </w:rPr>
+          <w:t>(“users”)</w:t>
+        </w:r>
+      </w:ins>
+    </w:p>
+    <w:p>
+      <w:pPr>
+        <w:pStyle w:val="ListParagraph"/>
+        <w:numPr>
+          <w:ilvl w:val="0"/>
+          <w:numId w:val="3"/>
+        </w:numPr>
+        <w:rPr>
+          <w:b/>
+          <w:bCs/>
+          <w:sz w:val="28"/>
+          <w:szCs w:val="28"/>
+          <w:lang w:val="en-US"/>
+          <w:rPrChange w:id="2263" w:author="Prakash Singh Kshatreeya" w:date="2026-05-10T11:57:00Z">
             <w:rPr>
               <w:lang w:val="en-US"/>
             </w:rPr>
           </w:rPrChange>
         </w:rPr>
-        <w:pPrChange w:id="2215" w:author="Prakash Singh Kshatreeya" w:date="2026-05-03T12:28:00Z">
+        <w:pPrChange w:id="2264" w:author="Prakash Singh Kshatreeya" w:date="2026-05-10T11:57:00Z">
           <w:pPr>
             <w:pStyle w:val="ListParagraph"/>
             <w:numPr>

</xml_diff>